<commit_message>
#420 - Range rediness date missing from generated PDF
</commit_message>
<xml_diff>
--- a/planTemplate.docx
+++ b/planTemplate.docx
@@ -4935,7 +4935,40 @@
                       <w:szCs w:val="18"/>
                       <w:lang w:val="en-US"/>
                     </w:rPr>
-                    <w:t>} to allow sufficient growth of the plant and proper soil conditions to develop</w:t>
+                    <w:t>}</w:t>
+                  </w:r>
+                  <w:r>
+                    <w:rPr>
+                      <w:rFonts w:ascii="Í∏4" w:hAnsi="Í∏4" w:cs="Í∏4"/>
+                      <w:color w:val="444444"/>
+                      <w:kern w:val="0"/>
+                      <w:sz w:val="18"/>
+                      <w:szCs w:val="18"/>
+                      <w:lang w:val="en-US"/>
+                    </w:rPr>
+                    <w:t>,</w:t>
+                  </w:r>
+                  <w:r>
+                    <w:rPr>
+                      <w:rFonts w:ascii="Í∏4" w:hAnsi="Í∏4" w:cs="Í∏4"/>
+                      <w:color w:val="444444"/>
+                      <w:kern w:val="0"/>
+                      <w:sz w:val="18"/>
+                      <w:szCs w:val="18"/>
+                      <w:lang w:val="en-US"/>
+                    </w:rPr>
+                    <w:t xml:space="preserve"> </w:t>
+                  </w:r>
+                  <w:r>
+                    <w:rPr>
+                      <w:rFonts w:ascii="Í∏4" w:hAnsi="Í∏4" w:cs="Í∏4"/>
+                      <w:color w:val="444444"/>
+                      <w:kern w:val="0"/>
+                      <w:sz w:val="18"/>
+                      <w:szCs w:val="18"/>
+                      <w:lang w:val="en-US"/>
+                    </w:rPr>
+                    <w:t>to allow sufficient growth of the plant and proper soil conditions to develop</w:t>
                   </w:r>
                 </w:p>
               </w:tc>

</xml_diff>